<commit_message>
Added questions doc for Lab3 (unfinished)
</commit_message>
<xml_diff>
--- a/SamLab2/Lab 2 Questions.docx
+++ b/SamLab2/Lab 2 Questions.docx
@@ -148,14 +148,14 @@
     </w:p>
     <w:p>
       <w:r>
-        <w:t xml:space="preserve">/odom is a publisher that provides information about the robot’s pose and twist. This is necessary </w:t>
-      </w:r>
-      <w:r>
-        <w:t xml:space="preserve">not really necessary for executing the arc (though it could be used to adjust cmd_vel commands), as it is used in this case to publish info about the robot’s pose </w:t>
+        <w:t xml:space="preserve">/odom is a publisher that provides information about the robot’s pose and twist. This is </w:t>
+      </w:r>
+      <w:r>
+        <w:t xml:space="preserve">not really necessary for executing the arc (though it could be used to adjust cmd_vel commands), as it is used in this case to publish info about the robot’s pose and twist. </w:t>
       </w:r>
       <w:r>
         <w:lastRenderedPageBreak/>
-        <w:t>and twist. This allows the action client to see if the robot has successfully achieved its goal and the deviation between the command and the result.</w:t>
+        <w:t>This allows the action client to see if the robot has successfully achieved its goal and the deviation between the command and the result.</w:t>
       </w:r>
       <w:r>
         <w:t xml:space="preserve"> </w:t>

</xml_diff>